<commit_message>
Align DSML docs and defaults
</commit_message>
<xml_diff>
--- a/templates/reference.docx
+++ b/templates/reference.docx
@@ -71,7 +71,7 @@
         <w:color w:val="666666"/>
         <w:sz w:val="18"/>
       </w:rPr>
-      <w:t>bigdata-uth</w:t>
+      <w:t>bigdata-dsml</w:t>
     </w:r>
     <w:r>
       <w:rPr>
@@ -110,7 +110,7 @@
         <w:color w:val="666666"/>
         <w:sz w:val="18"/>
       </w:rPr>
-      <w:t>bigdata-uth</w:t>
+      <w:t>bigdata-dsml</w:t>
     </w:r>
     <w:r>
       <w:rPr>

</xml_diff>